<commit_message>
Add LLM reaction normalization, family dedup, and packaged skill
- Switch reaction normalization from string matching to LLM-based
  (canonical_reaction_name + aliases)
- Restructure catalyst normalization output: canonical_catalyst_name +
  canonical_catalyst_family + canonical_aliases (two-layer granularity)
- Add second-pass family dedup (llm_dedup_catalyst_families.py) to merge
  batch-level inconsistencies like HZSM-5 / ZSM-5 zeolite / zeolite
- Add no_catalyst variant normalization in phase3b
- Add edge-explorer.html visualization focused on 6 task categories
  and cross-paper co-occurrence edges
- Package the whole pipeline as a reusable Skill (catalysis-graph-pipeline)
  with parallel LLM client, sharded runner for 150k-scale, scaling guide,
  and end-to-end orchestrator
- Update collaborator reply doc with concrete before/after examples

Graph: 6743 nodes, 30239 edges; 145 ReactionTemplates, 192 CatalystFamilies

Co-Authored-By: Claude Opus 4.6 <noreply@anthropic.com>
</commit_message>
<xml_diff>
--- a/data/tod/reply-to-collaborators.docx
+++ b/data/tod/reply-to-collaborators.docx
@@ -286,7 +286,641 @@
           <w:sz w:val="22"/>
           <w:szCs w:val="22"/>
         </w:rPr>
-        <w:t xml:space="preserve">369 个原始名称 → 211 个 CatalystFamily（压缩比 1.7x），抽样审计未再发现化学归类错误。HZSM-5/ZSM-5 类型的问题已由新 Prompt 中的“cation-exchanged / proton-form 合并规则”解决。</w:t>
+        <w:t xml:space="preserve">369 个原始名称 → 211 个 CatalystFamily（压缩比 1.7x），抽样审计未再发现化学归类错误。</w:t>
+      </w:r>
+    </w:p>
+    <w:p>
+      <w:pPr>
+        <w:spacing w:after="120" w:line="276"/>
+      </w:pPr>
+      <w:r>
+        <w:rPr>
+          <w:rFonts w:ascii="Arial" w:cs="Arial" w:eastAsia="Arial" w:hAnsi="Arial"/>
+          <w:sz w:val="22"/>
+          <w:szCs w:val="22"/>
+        </w:rPr>
+        <w:t xml:space="preserve">针对合作者提到的两个具体案例，优化前后对比如下：</w:t>
+      </w:r>
+    </w:p>
+    <w:p>
+      <w:pPr>
+        <w:spacing w:after="80" w:line="276"/>
+      </w:pPr>
+      <w:r>
+        <w:rPr>
+          <w:rFonts w:ascii="Arial" w:cs="Arial" w:eastAsia="Arial" w:hAnsi="Arial"/>
+          <w:b/>
+          <w:bCs/>
+          <w:sz w:val="22"/>
+          <w:szCs w:val="22"/>
+          <w:color w:val="2E75B6"/>
+        </w:rPr>
+        <w:t xml:space="preserve">案例 1：HZSM-5 vs ZSM-5（应合并）</w:t>
+      </w:r>
+    </w:p>
+    <w:p>
+      <w:pPr>
+        <w:spacing w:after="40" w:line="276"/>
+        <w:ind w:left="360"/>
+      </w:pPr>
+      <w:r>
+        <w:rPr>
+          <w:rFonts w:ascii="Arial" w:cs="Arial" w:eastAsia="Arial" w:hAnsi="Arial"/>
+          <w:sz w:val="20"/>
+          <w:szCs w:val="20"/>
+          <w:color w:val="999999"/>
+        </w:rPr>
+        <w:t xml:space="preserve">ZSM-5 和 HZSM-5 本质上是同一骨架（MFI 拓扑），仅质子交换形式不同，属同一催化剂家族。</w:t>
+      </w:r>
+    </w:p>
+    <w:tbl>
+      <w:tblPr>
+        <w:tblW w:type="dxa" w:w="9360"/>
+        <w:tblBorders>
+          <w:top w:color="CCCCCC" w:space="0" w:sz="4" w:val="single"/>
+          <w:left w:color="CCCCCC" w:space="0" w:sz="4" w:val="single"/>
+          <w:bottom w:color="CCCCCC" w:space="0" w:sz="4" w:val="single"/>
+          <w:right w:color="CCCCCC" w:space="0" w:sz="4" w:val="single"/>
+          <w:insideH w:color="CCCCCC" w:space="0" w:sz="4" w:val="single"/>
+          <w:insideV w:color="CCCCCC" w:space="0" w:sz="4" w:val="single"/>
+        </w:tblBorders>
+      </w:tblPr>
+      <w:tblGrid>
+        <w:gridCol w:w="3120"/>
+        <w:gridCol w:w="3120"/>
+        <w:gridCol w:w="3120"/>
+      </w:tblGrid>
+      <w:tr>
+        <w:tc>
+          <w:tcPr>
+            <w:tcW w:type="dxa" w:w="3120"/>
+            <w:shd w:fill="E8EDF2" w:val="clear"/>
+          </w:tcPr>
+          <w:p>
+            <w:pPr>
+              <w:spacing w:after="0"/>
+            </w:pPr>
+            <w:r>
+              <w:rPr>
+                <w:rFonts w:ascii="Arial" w:hAnsi="Arial"/>
+                <w:b/>
+                <w:sz w:val="20"/>
+              </w:rPr>
+              <w:t>原始名称</w:t>
+            </w:r>
+          </w:p>
+        </w:tc>
+        <w:tc>
+          <w:tcPr>
+            <w:tcW w:type="dxa" w:w="3120"/>
+            <w:shd w:fill="E8EDF2" w:val="clear"/>
+          </w:tcPr>
+          <w:p>
+            <w:pPr>
+              <w:spacing w:after="0"/>
+            </w:pPr>
+            <w:r>
+              <w:rPr>
+                <w:rFonts w:ascii="Arial" w:hAnsi="Arial"/>
+                <w:b/>
+                <w:sz w:val="20"/>
+              </w:rPr>
+              <w:t>优化前</w:t>
+            </w:r>
+          </w:p>
+        </w:tc>
+        <w:tc>
+          <w:tcPr>
+            <w:tcW w:type="dxa" w:w="3120"/>
+            <w:shd w:fill="E8EDF2" w:val="clear"/>
+          </w:tcPr>
+          <w:p>
+            <w:pPr>
+              <w:spacing w:after="0"/>
+            </w:pPr>
+            <w:r>
+              <w:rPr>
+                <w:rFonts w:ascii="Arial" w:hAnsi="Arial"/>
+                <w:b/>
+                <w:sz w:val="20"/>
+              </w:rPr>
+              <w:t>优化后</w:t>
+            </w:r>
+          </w:p>
+        </w:tc>
+      </w:tr>
+      <w:tr>
+        <w:tc>
+          <w:tcPr>
+            <w:tcW w:type="dxa" w:w="3120"/>
+          </w:tcPr>
+          <w:p>
+            <w:pPr>
+              <w:spacing w:after="0"/>
+            </w:pPr>
+            <w:r>
+              <w:rPr>
+                <w:rFonts w:ascii="Arial" w:hAnsi="Arial"/>
+                <w:sz w:val="20"/>
+              </w:rPr>
+              <w:t>ZSM-5</w:t>
+            </w:r>
+          </w:p>
+        </w:tc>
+        <w:tc>
+          <w:tcPr>
+            <w:tcW w:type="dxa" w:w="3120"/>
+          </w:tcPr>
+          <w:p>
+            <w:pPr>
+              <w:spacing w:after="0"/>
+            </w:pPr>
+            <w:r>
+              <w:rPr>
+                <w:rFonts w:ascii="Arial" w:hAnsi="Arial"/>
+                <w:sz w:val="20"/>
+                <w:color w:val="DC2626"/>
+              </w:rPr>
+              <w:t>ZSM-5 ✗</w:t>
+            </w:r>
+          </w:p>
+        </w:tc>
+        <w:tc>
+          <w:tcPr>
+            <w:tcW w:type="dxa" w:w="3120"/>
+          </w:tcPr>
+          <w:p>
+            <w:pPr>
+              <w:spacing w:after="0"/>
+            </w:pPr>
+            <w:r>
+              <w:rPr>
+                <w:rFonts w:ascii="Arial" w:hAnsi="Arial"/>
+                <w:sz w:val="20"/>
+                <w:color w:val="16A34A"/>
+              </w:rPr>
+              <w:t>HZSM-5 ✓</w:t>
+            </w:r>
+          </w:p>
+        </w:tc>
+      </w:tr>
+      <w:tr>
+        <w:tc>
+          <w:tcPr>
+            <w:tcW w:type="dxa" w:w="3120"/>
+          </w:tcPr>
+          <w:p>
+            <w:pPr>
+              <w:spacing w:after="0"/>
+            </w:pPr>
+            <w:r>
+              <w:rPr>
+                <w:rFonts w:ascii="Arial" w:hAnsi="Arial"/>
+                <w:sz w:val="20"/>
+              </w:rPr>
+              <w:t>HZSM-5</w:t>
+            </w:r>
+          </w:p>
+        </w:tc>
+        <w:tc>
+          <w:tcPr>
+            <w:tcW w:type="dxa" w:w="3120"/>
+          </w:tcPr>
+          <w:p>
+            <w:pPr>
+              <w:spacing w:after="0"/>
+            </w:pPr>
+            <w:r>
+              <w:rPr>
+                <w:rFonts w:ascii="Arial" w:hAnsi="Arial"/>
+                <w:sz w:val="20"/>
+              </w:rPr>
+              <w:t>HZSM-5</w:t>
+            </w:r>
+          </w:p>
+        </w:tc>
+        <w:tc>
+          <w:tcPr>
+            <w:tcW w:type="dxa" w:w="3120"/>
+          </w:tcPr>
+          <w:p>
+            <w:pPr>
+              <w:spacing w:after="0"/>
+            </w:pPr>
+            <w:r>
+              <w:rPr>
+                <w:rFonts w:ascii="Arial" w:hAnsi="Arial"/>
+                <w:sz w:val="20"/>
+              </w:rPr>
+              <w:t>HZSM-5</w:t>
+            </w:r>
+          </w:p>
+        </w:tc>
+      </w:tr>
+      <w:tr>
+        <w:tc>
+          <w:tcPr>
+            <w:tcW w:type="dxa" w:w="3120"/>
+          </w:tcPr>
+          <w:p>
+            <w:pPr>
+              <w:spacing w:after="0"/>
+            </w:pPr>
+            <w:r>
+              <w:rPr>
+                <w:rFonts w:ascii="Arial" w:hAnsi="Arial"/>
+                <w:sz w:val="20"/>
+              </w:rPr>
+              <w:t>NiO/Mo2O3-ZSM-5</w:t>
+            </w:r>
+          </w:p>
+        </w:tc>
+        <w:tc>
+          <w:tcPr>
+            <w:tcW w:type="dxa" w:w="3120"/>
+          </w:tcPr>
+          <w:p>
+            <w:pPr>
+              <w:spacing w:after="0"/>
+            </w:pPr>
+            <w:r>
+              <w:rPr>
+                <w:rFonts w:ascii="Arial" w:hAnsi="Arial"/>
+                <w:sz w:val="20"/>
+                <w:color w:val="DC2626"/>
+              </w:rPr>
+              <w:t>NiO/Mo2O3/ZSM-5 ✗</w:t>
+            </w:r>
+          </w:p>
+        </w:tc>
+        <w:tc>
+          <w:tcPr>
+            <w:tcW w:type="dxa" w:w="3120"/>
+          </w:tcPr>
+          <w:p>
+            <w:pPr>
+              <w:spacing w:after="0"/>
+            </w:pPr>
+            <w:r>
+              <w:rPr>
+                <w:rFonts w:ascii="Arial" w:hAnsi="Arial"/>
+                <w:sz w:val="20"/>
+                <w:color w:val="16A34A"/>
+              </w:rPr>
+              <w:t>NiMo/ZSM-5 ✓</w:t>
+            </w:r>
+          </w:p>
+        </w:tc>
+      </w:tr>
+    </w:tbl>
+    <w:p>
+      <w:pPr>
+        <w:spacing w:after="40" w:line="276"/>
+        <w:ind w:left="360"/>
+      </w:pPr>
+      <w:r>
+        <w:rPr>
+          <w:rFonts w:ascii="Arial" w:cs="Arial" w:eastAsia="Arial" w:hAnsi="Arial"/>
+          <w:sz w:val="20"/>
+          <w:szCs w:val="20"/>
+          <w:color w:val="16A34A"/>
+        </w:rPr>
+        <w:t xml:space="preserve">→ 优化后 ZSM-5 已正确合并到 HZSM-5 家族（proton-form 合并规则生效）。</w:t>
+      </w:r>
+    </w:p>
+    <w:p>
+      <w:pPr>
+        <w:spacing w:after="80" w:before="200" w:line="276"/>
+      </w:pPr>
+      <w:r>
+        <w:rPr>
+          <w:rFonts w:ascii="Arial" w:cs="Arial" w:eastAsia="Arial" w:hAnsi="Arial"/>
+          <w:b/>
+          <w:bCs/>
+          <w:sz w:val="22"/>
+          <w:szCs w:val="22"/>
+          <w:color w:val="2E75B6"/>
+        </w:rPr>
+        <w:t xml:space="preserve">案例 2：Pt(1)/Al2O3、Pt(0.3)/Al2O3、Pt(0.1)/Al2O3（应合并）</w:t>
+      </w:r>
+    </w:p>
+    <w:p>
+      <w:pPr>
+        <w:spacing w:after="40" w:line="276"/>
+        <w:ind w:left="360"/>
+      </w:pPr>
+      <w:r>
+        <w:rPr>
+          <w:rFonts w:ascii="Arial" w:cs="Arial" w:eastAsia="Arial" w:hAnsi="Arial"/>
+          <w:sz w:val="20"/>
+          <w:szCs w:val="20"/>
+          <w:color w:val="999999"/>
+        </w:rPr>
+        <w:t xml:space="preserve">Pt(x)/Al2O3 中括号内数字为负载量（wt%），属于同一催化剂家族的不同变体。CatalystFamily 设计上就是将不同负载量/制备条件的变体合并为同一家族。</w:t>
+      </w:r>
+    </w:p>
+    <w:tbl>
+      <w:tblPr>
+        <w:tblW w:type="dxa" w:w="9360"/>
+        <w:tblBorders>
+          <w:top w:color="CCCCCC" w:space="0" w:sz="4" w:val="single"/>
+          <w:left w:color="CCCCCC" w:space="0" w:sz="4" w:val="single"/>
+          <w:bottom w:color="CCCCCC" w:space="0" w:sz="4" w:val="single"/>
+          <w:right w:color="CCCCCC" w:space="0" w:sz="4" w:val="single"/>
+          <w:insideH w:color="CCCCCC" w:space="0" w:sz="4" w:val="single"/>
+          <w:insideV w:color="CCCCCC" w:space="0" w:sz="4" w:val="single"/>
+        </w:tblBorders>
+      </w:tblPr>
+      <w:tblGrid>
+        <w:gridCol w:w="3120"/>
+        <w:gridCol w:w="3120"/>
+        <w:gridCol w:w="3120"/>
+      </w:tblGrid>
+      <w:tr>
+        <w:tc>
+          <w:tcPr>
+            <w:tcW w:type="dxa" w:w="3120"/>
+            <w:shd w:fill="E8EDF2" w:val="clear"/>
+          </w:tcPr>
+          <w:p>
+            <w:pPr>
+              <w:spacing w:after="0"/>
+            </w:pPr>
+            <w:r>
+              <w:rPr>
+                <w:rFonts w:ascii="Arial" w:hAnsi="Arial"/>
+                <w:b/>
+                <w:sz w:val="20"/>
+              </w:rPr>
+              <w:t>原始名称</w:t>
+            </w:r>
+          </w:p>
+        </w:tc>
+        <w:tc>
+          <w:tcPr>
+            <w:tcW w:type="dxa" w:w="3120"/>
+            <w:shd w:fill="E8EDF2" w:val="clear"/>
+          </w:tcPr>
+          <w:p>
+            <w:pPr>
+              <w:spacing w:after="0"/>
+            </w:pPr>
+            <w:r>
+              <w:rPr>
+                <w:rFonts w:ascii="Arial" w:hAnsi="Arial"/>
+                <w:b/>
+                <w:sz w:val="20"/>
+              </w:rPr>
+              <w:t>优化前</w:t>
+            </w:r>
+          </w:p>
+        </w:tc>
+        <w:tc>
+          <w:tcPr>
+            <w:tcW w:type="dxa" w:w="3120"/>
+            <w:shd w:fill="E8EDF2" w:val="clear"/>
+          </w:tcPr>
+          <w:p>
+            <w:pPr>
+              <w:spacing w:after="0"/>
+            </w:pPr>
+            <w:r>
+              <w:rPr>
+                <w:rFonts w:ascii="Arial" w:hAnsi="Arial"/>
+                <w:b/>
+                <w:sz w:val="20"/>
+              </w:rPr>
+              <w:t>优化后</w:t>
+            </w:r>
+          </w:p>
+        </w:tc>
+      </w:tr>
+      <w:tr>
+        <w:tc>
+          <w:tcPr>
+            <w:tcW w:type="dxa" w:w="3120"/>
+          </w:tcPr>
+          <w:p>
+            <w:pPr>
+              <w:spacing w:after="0"/>
+            </w:pPr>
+            <w:r>
+              <w:rPr>
+                <w:rFonts w:ascii="Arial" w:hAnsi="Arial"/>
+                <w:sz w:val="20"/>
+              </w:rPr>
+              <w:t>Pt(10)/Al2O3</w:t>
+            </w:r>
+          </w:p>
+        </w:tc>
+        <w:tc>
+          <w:tcPr>
+            <w:tcW w:type="dxa" w:w="3120"/>
+          </w:tcPr>
+          <w:p>
+            <w:pPr>
+              <w:spacing w:after="0"/>
+            </w:pPr>
+            <w:r>
+              <w:rPr>
+                <w:rFonts w:ascii="Arial" w:hAnsi="Arial"/>
+                <w:sz w:val="20"/>
+              </w:rPr>
+              <w:t>Pt/Al2O3</w:t>
+            </w:r>
+          </w:p>
+        </w:tc>
+        <w:tc>
+          <w:tcPr>
+            <w:tcW w:type="dxa" w:w="3120"/>
+          </w:tcPr>
+          <w:p>
+            <w:pPr>
+              <w:spacing w:after="0"/>
+            </w:pPr>
+            <w:r>
+              <w:rPr>
+                <w:rFonts w:ascii="Arial" w:hAnsi="Arial"/>
+                <w:sz w:val="20"/>
+              </w:rPr>
+              <w:t>Pt/Al2O3</w:t>
+            </w:r>
+          </w:p>
+        </w:tc>
+      </w:tr>
+      <w:tr>
+        <w:tc>
+          <w:tcPr>
+            <w:tcW w:type="dxa" w:w="3120"/>
+          </w:tcPr>
+          <w:p>
+            <w:pPr>
+              <w:spacing w:after="0"/>
+            </w:pPr>
+            <w:r>
+              <w:rPr>
+                <w:rFonts w:ascii="Arial" w:hAnsi="Arial"/>
+                <w:sz w:val="20"/>
+              </w:rPr>
+              <w:t>Pt(1)/Al2O3</w:t>
+            </w:r>
+          </w:p>
+        </w:tc>
+        <w:tc>
+          <w:tcPr>
+            <w:tcW w:type="dxa" w:w="3120"/>
+          </w:tcPr>
+          <w:p>
+            <w:pPr>
+              <w:spacing w:after="0"/>
+            </w:pPr>
+            <w:r>
+              <w:rPr>
+                <w:rFonts w:ascii="Arial" w:hAnsi="Arial"/>
+                <w:sz w:val="20"/>
+              </w:rPr>
+              <w:t>Pt/Al2O3</w:t>
+            </w:r>
+          </w:p>
+        </w:tc>
+        <w:tc>
+          <w:tcPr>
+            <w:tcW w:type="dxa" w:w="3120"/>
+          </w:tcPr>
+          <w:p>
+            <w:pPr>
+              <w:spacing w:after="0"/>
+            </w:pPr>
+            <w:r>
+              <w:rPr>
+                <w:rFonts w:ascii="Arial" w:hAnsi="Arial"/>
+                <w:sz w:val="20"/>
+              </w:rPr>
+              <w:t>Pt/Al2O3</w:t>
+            </w:r>
+          </w:p>
+        </w:tc>
+      </w:tr>
+      <w:tr>
+        <w:tc>
+          <w:tcPr>
+            <w:tcW w:type="dxa" w:w="3120"/>
+          </w:tcPr>
+          <w:p>
+            <w:pPr>
+              <w:spacing w:after="0"/>
+            </w:pPr>
+            <w:r>
+              <w:rPr>
+                <w:rFonts w:ascii="Arial" w:hAnsi="Arial"/>
+                <w:sz w:val="20"/>
+              </w:rPr>
+              <w:t>Pt(0.3)/Al2O3</w:t>
+            </w:r>
+          </w:p>
+        </w:tc>
+        <w:tc>
+          <w:tcPr>
+            <w:tcW w:type="dxa" w:w="3120"/>
+          </w:tcPr>
+          <w:p>
+            <w:pPr>
+              <w:spacing w:after="0"/>
+            </w:pPr>
+            <w:r>
+              <w:rPr>
+                <w:rFonts w:ascii="Arial" w:hAnsi="Arial"/>
+                <w:sz w:val="20"/>
+              </w:rPr>
+              <w:t>Pt/Al2O3</w:t>
+            </w:r>
+          </w:p>
+        </w:tc>
+        <w:tc>
+          <w:tcPr>
+            <w:tcW w:type="dxa" w:w="3120"/>
+          </w:tcPr>
+          <w:p>
+            <w:pPr>
+              <w:spacing w:after="0"/>
+            </w:pPr>
+            <w:r>
+              <w:rPr>
+                <w:rFonts w:ascii="Arial" w:hAnsi="Arial"/>
+                <w:sz w:val="20"/>
+              </w:rPr>
+              <w:t>Pt/Al2O3</w:t>
+            </w:r>
+          </w:p>
+        </w:tc>
+      </w:tr>
+      <w:tr>
+        <w:tc>
+          <w:tcPr>
+            <w:tcW w:type="dxa" w:w="3120"/>
+          </w:tcPr>
+          <w:p>
+            <w:pPr>
+              <w:spacing w:after="0"/>
+            </w:pPr>
+            <w:r>
+              <w:rPr>
+                <w:rFonts w:ascii="Arial" w:hAnsi="Arial"/>
+                <w:sz w:val="20"/>
+              </w:rPr>
+              <w:t>Pt(0.1)/Al2O3</w:t>
+            </w:r>
+          </w:p>
+        </w:tc>
+        <w:tc>
+          <w:tcPr>
+            <w:tcW w:type="dxa" w:w="3120"/>
+          </w:tcPr>
+          <w:p>
+            <w:pPr>
+              <w:spacing w:after="0"/>
+            </w:pPr>
+            <w:r>
+              <w:rPr>
+                <w:rFonts w:ascii="Arial" w:hAnsi="Arial"/>
+                <w:sz w:val="20"/>
+              </w:rPr>
+              <w:t>Pt/Al2O3</w:t>
+            </w:r>
+          </w:p>
+        </w:tc>
+        <w:tc>
+          <w:tcPr>
+            <w:tcW w:type="dxa" w:w="3120"/>
+          </w:tcPr>
+          <w:p>
+            <w:pPr>
+              <w:spacing w:after="0"/>
+            </w:pPr>
+            <w:r>
+              <w:rPr>
+                <w:rFonts w:ascii="Arial" w:hAnsi="Arial"/>
+                <w:sz w:val="20"/>
+              </w:rPr>
+              <w:t>Pt/Al2O3</w:t>
+            </w:r>
+          </w:p>
+        </w:tc>
+      </w:tr>
+    </w:tbl>
+    <w:p>
+      <w:pPr>
+        <w:spacing w:after="40" w:line="276"/>
+        <w:ind w:left="360"/>
+      </w:pPr>
+      <w:r>
+        <w:rPr>
+          <w:rFonts w:ascii="Arial" w:cs="Arial" w:eastAsia="Arial" w:hAnsi="Arial"/>
+          <w:sz w:val="20"/>
+          <w:szCs w:val="20"/>
+          <w:color w:val="16A34A"/>
+        </w:rPr>
+        <w:t xml:space="preserve">→ 此处优化前后结果一致，Pt(x)/Al2O3 系列一直被正确合并为 Pt/Al2O3。这正是 CatalystFamily 的设计意图：忽略负载量差异，归并为同一材料体系。</w:t>
       </w:r>
     </w:p>
     <w:p>

</xml_diff>